<commit_message>
Memorial Descritivo - Rascunho
Atualizações na trajetória do aluno
</commit_message>
<xml_diff>
--- a/Memorial Descritivo - Felipe Freitas Silva.docx
+++ b/Memorial Descritivo - Felipe Freitas Silva.docx
@@ -4759,7 +4759,13 @@
     </w:p>
     <w:p>
       <w:r>
-        <w:t xml:space="preserve">Desde o começo de 2023, sou o principal desenvolvedor da Startup e tenho já um colega responsável pelo </w:t>
+        <w:t xml:space="preserve">Desde o começo de 2023, </w:t>
+      </w:r>
+      <w:r>
+        <w:t xml:space="preserve">fui </w:t>
+      </w:r>
+      <w:r>
+        <w:t xml:space="preserve"> o principal desenvolvedor da Startup e tenho já um colega responsável pelo </w:t>
       </w:r>
       <w:r>
         <w:rPr>
@@ -4947,6 +4953,14 @@
       <w:bookmarkEnd w:id="4"/>
       <w:r>
         <w:t>, por exemplo.</w:t>
+      </w:r>
+    </w:p>
+    <w:p>
+      <w:r>
+        <w:t>No terceiro ano do curso continuei me aprimorando no trabalho e pessoalmente, explorando ainda mais novas áreas que ainda não tinha tido acesso ou curiosidade de aprender, como desenvolver uma aplicação de terminal em python no estágio e disciplinas que olhando para trás ainda julgo como sendo minhas favoritas do curso: Sistemas Operacionais (programação de baixo nível) e Redes de Computadores, ambas inclusive lecionadas por professores fantásticos que merecem muito reconhecimento pois demonstravam um apreço enorme pela área e clara vontade em repassar esse sentimento para os alunos – Sérgio Johann Filho e Cristina Nunes. Mais para o final do ano, apliquei para o programa de Mobilidade Acadêmica da PUCRS e, mais ou menos um mês depois, em Agosto, 1 ano após minha entrada no LIS</w:t>
+      </w:r>
+      <w:r>
+        <w:t>, recebi uma proposta para trabalhar como Desenvolvedor Front-End Júnior na HP, que aceitei.</w:t>
       </w:r>
     </w:p>
     <w:p>
@@ -12688,7 +12702,7 @@
         <mc:AlternateContent>
           <mc:Choice Requires="wpg">
             <w:drawing>
-              <wp:anchor distT="0" distB="0" distL="114300" distR="114300" simplePos="0" relativeHeight="251681792" behindDoc="0" locked="0" layoutInCell="1" allowOverlap="1" wp14:anchorId="20E71530" wp14:editId="14CD5D96">
+              <wp:anchor distT="0" distB="0" distL="114300" distR="114300" simplePos="0" relativeHeight="251681792" behindDoc="0" locked="0" layoutInCell="1" allowOverlap="1" wp14:anchorId="20E71530" wp14:editId="55D3FD2C">
                 <wp:simplePos x="0" y="0"/>
                 <wp:positionH relativeFrom="column">
                   <wp:posOffset>-2540</wp:posOffset>
@@ -22439,10 +22453,6 @@
 </file>
 
 <file path=customXml/item1.xml><?xml version="1.0" encoding="utf-8"?>
-<b:Sources xmlns:b="http://schemas.openxmlformats.org/officeDocument/2006/bibliography" xmlns="http://schemas.openxmlformats.org/officeDocument/2006/bibliography" SelectedStyle="\APA.XSL" StyleName="APA"/>
-</file>
-
-<file path=customXml/item2.xml><?xml version="1.0" encoding="utf-8"?>
 <ct:contentTypeSchema xmlns:ct="http://schemas.microsoft.com/office/2006/metadata/contentType" xmlns:ma="http://schemas.microsoft.com/office/2006/metadata/properties/metaAttributes" ct:_="" ma:_="" ma:contentTypeName="Documento" ma:contentTypeID="0x01010081DB4EF2F44E8741A3B7C64E26A81F39" ma:contentTypeVersion="6" ma:contentTypeDescription="Crie um novo documento." ma:contentTypeScope="" ma:versionID="6f2e3708269f143ed3a4c7993f585491">
   <xsd:schema xmlns:xsd="http://www.w3.org/2001/XMLSchema" xmlns:xs="http://www.w3.org/2001/XMLSchema" xmlns:p="http://schemas.microsoft.com/office/2006/metadata/properties" xmlns:ns3="bbfbb147-0e8d-4867-bc3c-168a7971256d" xmlns:ns4="ba43e9b5-5c3c-4b61-86b4-9718ce237837" targetNamespace="http://schemas.microsoft.com/office/2006/metadata/properties" ma:root="true" ma:fieldsID="7b54ec636d669d228c54f9a9b856f2dc" ns3:_="" ns4:_="">
     <xsd:import namespace="bbfbb147-0e8d-4867-bc3c-168a7971256d"/>
@@ -22619,6 +22629,14 @@
 </ct:contentTypeSchema>
 </file>
 
+<file path=customXml/item2.xml><?xml version="1.0" encoding="utf-8"?>
+<p:properties xmlns:p="http://schemas.microsoft.com/office/2006/metadata/properties" xmlns:xsi="http://www.w3.org/2001/XMLSchema-instance" xmlns:pc="http://schemas.microsoft.com/office/infopath/2007/PartnerControls">
+  <documentManagement>
+    <_activity xmlns="bbfbb147-0e8d-4867-bc3c-168a7971256d" xsi:nil="true"/>
+  </documentManagement>
+</p:properties>
+</file>
+
 <file path=customXml/item3.xml><?xml version="1.0" encoding="utf-8"?>
 <?mso-contentType ?>
 <FormTemplates xmlns="http://schemas.microsoft.com/sharepoint/v3/contenttype/forms">
@@ -22629,22 +22647,10 @@
 </file>
 
 <file path=customXml/item4.xml><?xml version="1.0" encoding="utf-8"?>
-<p:properties xmlns:p="http://schemas.microsoft.com/office/2006/metadata/properties" xmlns:xsi="http://www.w3.org/2001/XMLSchema-instance" xmlns:pc="http://schemas.microsoft.com/office/infopath/2007/PartnerControls">
-  <documentManagement>
-    <_activity xmlns="bbfbb147-0e8d-4867-bc3c-168a7971256d" xsi:nil="true"/>
-  </documentManagement>
-</p:properties>
+<b:Sources xmlns:b="http://schemas.openxmlformats.org/officeDocument/2006/bibliography" xmlns="http://schemas.openxmlformats.org/officeDocument/2006/bibliography" SelectedStyle="\APA.XSL" StyleName="APA"/>
 </file>
 
 <file path=customXml/itemProps1.xml><?xml version="1.0" encoding="utf-8"?>
-<ds:datastoreItem xmlns:ds="http://schemas.openxmlformats.org/officeDocument/2006/customXml" ds:itemID="{4AC63BDB-EC17-5E45-9618-2D74317BCB64}">
-  <ds:schemaRefs>
-    <ds:schemaRef ds:uri="http://schemas.openxmlformats.org/officeDocument/2006/bibliography"/>
-  </ds:schemaRefs>
-</ds:datastoreItem>
-</file>
-
-<file path=customXml/itemProps2.xml><?xml version="1.0" encoding="utf-8"?>
 <ds:datastoreItem xmlns:ds="http://schemas.openxmlformats.org/officeDocument/2006/customXml" ds:itemID="{60195475-E937-4DA5-A08F-CE68322380E7}">
   <ds:schemaRefs>
     <ds:schemaRef ds:uri="http://schemas.microsoft.com/office/2006/metadata/contentType"/>
@@ -22663,6 +22669,16 @@
 </ds:datastoreItem>
 </file>
 
+<file path=customXml/itemProps2.xml><?xml version="1.0" encoding="utf-8"?>
+<ds:datastoreItem xmlns:ds="http://schemas.openxmlformats.org/officeDocument/2006/customXml" ds:itemID="{8E77C127-0816-49DA-827F-5C1A0263A5E6}">
+  <ds:schemaRefs>
+    <ds:schemaRef ds:uri="http://schemas.microsoft.com/office/2006/metadata/properties"/>
+    <ds:schemaRef ds:uri="http://schemas.microsoft.com/office/infopath/2007/PartnerControls"/>
+    <ds:schemaRef ds:uri="bbfbb147-0e8d-4867-bc3c-168a7971256d"/>
+  </ds:schemaRefs>
+</ds:datastoreItem>
+</file>
+
 <file path=customXml/itemProps3.xml><?xml version="1.0" encoding="utf-8"?>
 <ds:datastoreItem xmlns:ds="http://schemas.openxmlformats.org/officeDocument/2006/customXml" ds:itemID="{1E043D33-BE45-47FF-B156-F45B0E9C9300}">
   <ds:schemaRefs>
@@ -22672,11 +22688,9 @@
 </file>
 
 <file path=customXml/itemProps4.xml><?xml version="1.0" encoding="utf-8"?>
-<ds:datastoreItem xmlns:ds="http://schemas.openxmlformats.org/officeDocument/2006/customXml" ds:itemID="{8E77C127-0816-49DA-827F-5C1A0263A5E6}">
+<ds:datastoreItem xmlns:ds="http://schemas.openxmlformats.org/officeDocument/2006/customXml" ds:itemID="{4AC63BDB-EC17-5E45-9618-2D74317BCB64}">
   <ds:schemaRefs>
-    <ds:schemaRef ds:uri="http://schemas.microsoft.com/office/2006/metadata/properties"/>
-    <ds:schemaRef ds:uri="http://schemas.microsoft.com/office/infopath/2007/PartnerControls"/>
-    <ds:schemaRef ds:uri="bbfbb147-0e8d-4867-bc3c-168a7971256d"/>
+    <ds:schemaRef ds:uri="http://schemas.openxmlformats.org/officeDocument/2006/bibliography"/>
   </ds:schemaRefs>
 </ds:datastoreItem>
 </file>
</xml_diff>